<commit_message>
Actualiza el diario del proyecto con la sesion 2 (V3) y el inicio de la sesion 3 (V3.5)
</commit_message>
<xml_diff>
--- a/DIARIO-DEL-PROYECTO.docx
+++ b/DIARIO-DEL-PROYECTO.docx
@@ -464,6 +464,461 @@
       </w:r>
     </w:p>
     <w:p>
+      <w:pPr>
+        <w:pStyle w:val="Heading2"/>
+      </w:pPr>
+      <w:r>
+        <w:t>Sesión 2 — El mapa interactivo (V3)</w:t>
+      </w:r>
+    </w:p>
+    <w:p>
+      <w:r>
+        <w:rPr>
+          <w:i/>
+        </w:rPr>
+        <w:t>El itinerario deja de ser texto y se dibuja sobre la ciudad.</w:t>
+      </w:r>
+    </w:p>
+    <w:p>
+      <w:pPr>
+        <w:pStyle w:val="Heading3"/>
+      </w:pPr>
+      <w:r>
+        <w:t>Preparativos</w:t>
+      </w:r>
+    </w:p>
+    <w:p>
+      <w:pPr>
+        <w:pStyle w:val="ListBullet"/>
+      </w:pPr>
+      <w:r>
+        <w:t>El diario del proyecto (este documento) entró en el repositorio, ahora en formato Word.</w:t>
+      </w:r>
+    </w:p>
+    <w:p>
+      <w:pPr>
+        <w:pStyle w:val="ListBullet"/>
+      </w:pPr>
+      <w:r>
+        <w:t xml:space="preserve">Decisión de diseño previa: usar </w:t>
+      </w:r>
+      <w:r>
+        <w:rPr>
+          <w:b/>
+        </w:rPr>
+        <w:t>Leaflet + OpenStreetMap</w:t>
+      </w:r>
+      <w:r>
+        <w:t xml:space="preserve"> — librería veterana, gratuita, sin API key ni registro.</w:t>
+      </w:r>
+    </w:p>
+    <w:p>
+      <w:pPr>
+        <w:pStyle w:val="Heading3"/>
+      </w:pPr>
+      <w:r>
+        <w:t>Paso 1 — La fontanería</w:t>
+      </w:r>
+    </w:p>
+    <w:p>
+      <w:pPr>
+        <w:pStyle w:val="ListBullet"/>
+      </w:pPr>
+      <w:r>
+        <w:t xml:space="preserve">Leaflet añadido vía CDN en </w:t>
+      </w:r>
+      <w:r>
+        <w:rPr>
+          <w:rFonts w:ascii="Consolas" w:hAnsi="Consolas"/>
+        </w:rPr>
+        <w:t>index.html</w:t>
+      </w:r>
+      <w:r>
+        <w:t>.</w:t>
+      </w:r>
+    </w:p>
+    <w:p>
+      <w:pPr>
+        <w:pStyle w:val="ListBullet"/>
+      </w:pPr>
+      <w:r>
+        <w:t xml:space="preserve">Nuevo archivo </w:t>
+      </w:r>
+      <w:r>
+        <w:rPr>
+          <w:rFonts w:ascii="Consolas" w:hAnsi="Consolas"/>
+        </w:rPr>
+        <w:t>map.js</w:t>
+      </w:r>
+      <w:r>
+        <w:t xml:space="preserve">: el mapa vive en su propio archivo para que </w:t>
+      </w:r>
+      <w:r>
+        <w:rPr>
+          <w:rFonts w:ascii="Consolas" w:hAnsi="Consolas"/>
+        </w:rPr>
+        <w:t>script.js</w:t>
+      </w:r>
+      <w:r>
+        <w:t xml:space="preserve"> no siga engordando (regla del CLAUDE.md: dividir antes de que crezca demasiado).</w:t>
+      </w:r>
+    </w:p>
+    <w:p>
+      <w:pPr>
+        <w:pStyle w:val="ListBullet"/>
+      </w:pPr>
+      <w:r>
+        <w:t xml:space="preserve">Contenedor </w:t>
+      </w:r>
+      <w:r>
+        <w:rPr>
+          <w:rFonts w:ascii="Consolas" w:hAnsi="Consolas"/>
+        </w:rPr>
+        <w:t>#map-section</w:t>
+      </w:r>
+      <w:r>
+        <w:t xml:space="preserve"> oculto por defecto. Un paso entero sin nada visible: primero la infraestructura, luego el espectáculo.</w:t>
+      </w:r>
+    </w:p>
+    <w:p>
+      <w:pPr>
+        <w:pStyle w:val="Heading3"/>
+      </w:pPr>
+      <w:r>
+        <w:t>Paso 2 — El mapa cobra vida</w:t>
+      </w:r>
+    </w:p>
+    <w:p>
+      <w:pPr>
+        <w:pStyle w:val="ListBullet"/>
+      </w:pPr>
+      <w:r>
+        <w:rPr>
+          <w:rFonts w:ascii="Consolas" w:hAnsi="Consolas"/>
+        </w:rPr>
+        <w:t>renderMap(aiData)</w:t>
+      </w:r>
+      <w:r>
+        <w:t xml:space="preserve"> crea el mapa y, por cada día, un </w:t>
+      </w:r>
+      <w:r>
+        <w:rPr>
+          <w:rFonts w:ascii="Consolas" w:hAnsi="Consolas"/>
+        </w:rPr>
+        <w:t>L.layerGroup</w:t>
+      </w:r>
+      <w:r>
+        <w:t xml:space="preserve"> con: marcadores numerados (1/2/3 = mañana/tarde/noche) del color del día, popups con lugar + franja + precio, y una línea conectando la ruta del día.</w:t>
+      </w:r>
+    </w:p>
+    <w:p>
+      <w:pPr>
+        <w:pStyle w:val="ListBullet"/>
+      </w:pPr>
+      <w:r>
+        <w:rPr>
+          <w:rFonts w:ascii="Consolas" w:hAnsi="Consolas"/>
+        </w:rPr>
+        <w:t>fitBounds()</w:t>
+      </w:r>
+      <w:r>
+        <w:t xml:space="preserve"> ajusta zoom y centro automáticamente para abarcar todos los puntos.</w:t>
+      </w:r>
+    </w:p>
+    <w:p>
+      <w:pPr>
+        <w:pStyle w:val="ListBullet"/>
+      </w:pPr>
+      <w:r>
+        <w:t>Si había un mapa de una búsqueda anterior, se destruye (</w:t>
+      </w:r>
+      <w:r>
+        <w:rPr>
+          <w:rFonts w:ascii="Consolas" w:hAnsi="Consolas"/>
+        </w:rPr>
+        <w:t>map.remove()</w:t>
+      </w:r>
+      <w:r>
+        <w:t>) antes de crear el nuevo — si no, Leaflet protesta.</w:t>
+      </w:r>
+    </w:p>
+    <w:p>
+      <w:pPr>
+        <w:pStyle w:val="ListBullet"/>
+      </w:pPr>
+      <w:r>
+        <w:t>El mapa solo aparece con itinerarios de IA (el fallback de reglas no tiene coordenadas reales).</w:t>
+      </w:r>
+    </w:p>
+    <w:p>
+      <w:pPr>
+        <w:pStyle w:val="ListBullet"/>
+      </w:pPr>
+      <w:r>
+        <w:rPr>
+          <w:b/>
+        </w:rPr>
+        <w:t>Primera prueba (Madrid, 2 días, cultural):</w:t>
+      </w:r>
+      <w:r>
+        <w:t xml:space="preserve"> dos rutas de colores sobre el mapa real de Madrid — Palacio Real, Templo de Debod, Retiro... El momento más visual del proyecto hasta la fecha.</w:t>
+      </w:r>
+    </w:p>
+    <w:p>
+      <w:pPr>
+        <w:pStyle w:val="Heading3"/>
+      </w:pPr>
+      <w:r>
+        <w:t>Paso 3 — Filtros por día</w:t>
+      </w:r>
+    </w:p>
+    <w:p>
+      <w:pPr>
+        <w:pStyle w:val="ListBullet"/>
+      </w:pPr>
+      <w:r>
+        <w:t xml:space="preserve">Botones "Todos" + uno por día, cada uno del color de sus marcadores (variable CSS </w:t>
+      </w:r>
+      <w:r>
+        <w:rPr>
+          <w:rFonts w:ascii="Consolas" w:hAnsi="Consolas"/>
+        </w:rPr>
+        <w:t>--day-color</w:t>
+      </w:r>
+      <w:r>
+        <w:t xml:space="preserve"> por botón).</w:t>
+      </w:r>
+    </w:p>
+    <w:p>
+      <w:pPr>
+        <w:pStyle w:val="ListBullet"/>
+      </w:pPr>
+      <w:r>
+        <w:t>Al pulsar un día: se ocultan las capas del resto (</w:t>
+      </w:r>
+      <w:r>
+        <w:rPr>
+          <w:rFonts w:ascii="Consolas" w:hAnsi="Consolas"/>
+        </w:rPr>
+        <w:t>removeLayer</w:t>
+      </w:r>
+      <w:r>
+        <w:t>), queda solo su ruta, y el zoom se reajusta a esos puntos. "Todos" restaura la vista completa.</w:t>
+      </w:r>
+    </w:p>
+    <w:p>
+      <w:pPr>
+        <w:pStyle w:val="ListBullet"/>
+      </w:pPr>
+      <w:r>
+        <w:t>La arquitectura de capas del Paso 2 hizo que esta feature fuera trivial: mostrar/ocultar, sin redibujar nada. La decisión de diseño pagó dividendos en 24 horas.</w:t>
+      </w:r>
+    </w:p>
+    <w:p>
+      <w:pPr>
+        <w:pStyle w:val="ListBullet"/>
+      </w:pPr>
+      <w:r>
+        <w:t>Probado con Sevilla, 2 días: filtros y zoom funcionando a la primera.</w:t>
+      </w:r>
+    </w:p>
+    <w:p>
+      <w:pPr>
+        <w:pStyle w:val="Heading3"/>
+      </w:pPr>
+      <w:r>
+        <w:t>Paso 4 — Pulido final del mapa</w:t>
+      </w:r>
+    </w:p>
+    <w:p>
+      <w:pPr>
+        <w:pStyle w:val="ListBullet"/>
+      </w:pPr>
+      <w:r>
+        <w:t>El mapa y los filtros entraron en una tarjeta "glass" como el resto de la interfaz, en vez de flotar sobre el degradado.</w:t>
+      </w:r>
+    </w:p>
+    <w:p>
+      <w:pPr>
+        <w:pStyle w:val="ListBullet"/>
+      </w:pPr>
+      <w:r>
+        <w:t>Responsive: en móvil el mapa baja a 250px de altura y los botones se compactan.</w:t>
+      </w:r>
+    </w:p>
+    <w:p>
+      <w:pPr>
+        <w:pStyle w:val="ListBullet"/>
+      </w:pPr>
+      <w:r>
+        <w:t xml:space="preserve">Detalle fino: </w:t>
+      </w:r>
+      <w:r>
+        <w:rPr>
+          <w:rFonts w:ascii="Consolas" w:hAnsi="Consolas"/>
+        </w:rPr>
+        <w:t>invalidateSize()</w:t>
+      </w:r>
+      <w:r>
+        <w:t xml:space="preserve"> en el evento </w:t>
+      </w:r>
+      <w:r>
+        <w:rPr>
+          <w:rFonts w:ascii="Consolas" w:hAnsi="Consolas"/>
+        </w:rPr>
+        <w:t>resize</w:t>
+      </w:r>
+      <w:r>
+        <w:t xml:space="preserve"> — Leaflet no reajusta sus tiles solo si el contenedor cambia de tamaño (ej. girar el móvil), y sin esto el mapa queda recortado.</w:t>
+      </w:r>
+    </w:p>
+    <w:p>
+      <w:pPr>
+        <w:pStyle w:val="Heading3"/>
+      </w:pPr>
+      <w:r>
+        <w:t>✅ V3 completa</w:t>
+      </w:r>
+    </w:p>
+    <w:p>
+      <w:r>
+        <w:t>Mapa interactivo con marcadores numerados, popups, rutas por día, filtros de colores y ajuste automático de zoom. La app ya se ve, se entiende y se navega como un producto de verdad.</w:t>
+      </w:r>
+    </w:p>
+    <w:p>
+      <w:pPr>
+        <w:pStyle w:val="Heading2"/>
+      </w:pPr>
+      <w:r>
+        <w:t>Sesión 3 — V3.5: pulido pre-publicación</w:t>
+      </w:r>
+    </w:p>
+    <w:p>
+      <w:r>
+        <w:rPr>
+          <w:i/>
+        </w:rPr>
+        <w:t>Revisión honesta antes de publicar: ¿qué le falta para que la use gente de verdad?</w:t>
+      </w:r>
+    </w:p>
+    <w:p>
+      <w:pPr>
+        <w:pStyle w:val="Heading3"/>
+      </w:pPr>
+      <w:r>
+        <w:t>La auditoría</w:t>
+      </w:r>
+    </w:p>
+    <w:p>
+      <w:r>
+        <w:t>Con la V3 cerrada, paramos a mirar la app con ojos de usuario. Diagnóstico: (1) la key en el navegador — bloqueante, se resuelve al publicar; (2) el plan se pierde al cerrar la pestaña; (3) destinos inventados producen itinerarios inventados; (4) faltaba favicon y meta tags para compartir el enlace.</w:t>
+      </w:r>
+    </w:p>
+    <w:p>
+      <w:pPr>
+        <w:pStyle w:val="Heading3"/>
+      </w:pPr>
+      <w:r>
+        <w:t>Parte A — Que el plan no se pierda ✅</w:t>
+      </w:r>
+    </w:p>
+    <w:p>
+      <w:pPr>
+        <w:pStyle w:val="ListBullet"/>
+      </w:pPr>
+      <w:r>
+        <w:rPr>
+          <w:b/>
+        </w:rPr>
+        <w:t>localStorage</w:t>
+      </w:r>
+      <w:r>
+        <w:t>: el último plan se guarda automáticamente en el navegador y se restaura al volver a abrir la página, con aviso "Tu último plan: Roma, 5 días" y botón para empezar de cero.</w:t>
+      </w:r>
+    </w:p>
+    <w:p>
+      <w:pPr>
+        <w:pStyle w:val="ListBullet"/>
+      </w:pPr>
+      <w:r>
+        <w:rPr>
+          <w:b/>
+        </w:rPr>
+        <w:t>Botón Imprimir / Guardar PDF</w:t>
+      </w:r>
+      <w:r>
+        <w:t xml:space="preserve">: </w:t>
+      </w:r>
+      <w:r>
+        <w:rPr>
+          <w:rFonts w:ascii="Consolas" w:hAnsi="Consolas"/>
+        </w:rPr>
+        <w:t>window.print()</w:t>
+      </w:r>
+      <w:r>
+        <w:t xml:space="preserve"> + estilos </w:t>
+      </w:r>
+      <w:r>
+        <w:rPr>
+          <w:rFonts w:ascii="Consolas" w:hAnsi="Consolas"/>
+        </w:rPr>
+        <w:t>@media print</w:t>
+      </w:r>
+      <w:r>
+        <w:t xml:space="preserve"> — la misma página tiene dos caras: la web con degradado y la versión imprimible en blanco y negro, sin formulario ni mapa, ajustada a A4 y con </w:t>
+      </w:r>
+      <w:r>
+        <w:rPr>
+          <w:rFonts w:ascii="Consolas" w:hAnsi="Consolas"/>
+        </w:rPr>
+        <w:t>break-inside: avoid</w:t>
+      </w:r>
+      <w:r>
+        <w:t xml:space="preserve"> para que las tarjetas no se partan entre páginas.</w:t>
+      </w:r>
+    </w:p>
+    <w:p>
+      <w:pPr>
+        <w:pStyle w:val="Heading3"/>
+      </w:pPr>
+      <w:r>
+        <w:t>Pendiente</w:t>
+      </w:r>
+    </w:p>
+    <w:p>
+      <w:pPr>
+        <w:pStyle w:val="ListBullet"/>
+      </w:pPr>
+      <w:r>
+        <w:t xml:space="preserve">Parte B: detección de destinos inválidos (campo </w:t>
+      </w:r>
+      <w:r>
+        <w:rPr>
+          <w:rFonts w:ascii="Consolas" w:hAnsi="Consolas"/>
+        </w:rPr>
+        <w:t>validDestination</w:t>
+      </w:r>
+      <w:r>
+        <w:t xml:space="preserve"> en el esquema de Gemini).</w:t>
+      </w:r>
+    </w:p>
+    <w:p>
+      <w:pPr>
+        <w:pStyle w:val="ListBullet"/>
+      </w:pPr>
+      <w:r>
+        <w:t>Parte C: favicon y meta tags Open Graph.</w:t>
+      </w:r>
+    </w:p>
+    <w:p>
+      <w:pPr>
+        <w:pStyle w:val="ListBullet"/>
+      </w:pPr>
+      <w:r>
+        <w:t>Publicación online (GitHub + Vercel) con la API key protegida en el servidor — el último gran hito.</w:t>
+      </w:r>
+    </w:p>
+    <w:p>
       <w:r>
         <w:rPr>
           <w:i/>
@@ -1135,102 +1590,7 @@
         <w:t>buildPrompt()</w:t>
       </w:r>
       <w:r>
-        <w:t>): la calidad del prompt determina la calidad del itinerario.</w:t>
-      </w:r>
-    </w:p>
-    <w:p>
-      <w:pPr>
-        <w:pStyle w:val="ListBullet"/>
-      </w:pPr>
-      <w:r>
-        <w:t xml:space="preserve">La IA sabe cosas "de memoria": precios y datos pueden estar desactualizados. Mostrarlos siempre como </w:t>
-      </w:r>
-      <w:r>
-        <w:rPr>
-          <w:b/>
-        </w:rPr>
-        <w:t>estimaciones</w:t>
-      </w:r>
-      <w:r>
-        <w:t xml:space="preserve"> y decírselo al usuario.</w:t>
-      </w:r>
-    </w:p>
-    <w:p>
-      <w:pPr>
-        <w:pStyle w:val="Heading3"/>
-      </w:pPr>
-      <w:r>
-        <w:t>10. Graceful degradation (degradación elegante)</w:t>
-      </w:r>
-    </w:p>
-    <w:p>
-      <w:pPr>
-        <w:pStyle w:val="ListBullet"/>
-      </w:pPr>
-      <w:r>
-        <w:t>Toda app que depende de un servicio externo necesita un plan para cuando ese servicio falla.</w:t>
-      </w:r>
-    </w:p>
-    <w:p>
-      <w:pPr>
-        <w:pStyle w:val="ListBullet"/>
-      </w:pPr>
-      <w:r>
-        <w:t>La nuestra: sin key → reglas directamente; error o JSON malformado → reintento → reglas + aviso amarillo.</w:t>
-      </w:r>
-    </w:p>
-    <w:p>
-      <w:pPr>
-        <w:pStyle w:val="ListBullet"/>
-      </w:pPr>
-      <w:r>
-        <w:t>El usuario siempre ve algo útil, nunca una pantalla rota. Lo vivimos de verdad: la IA falló por 3 motivos distintos y la app siguió funcionando las 3 veces.</w:t>
-      </w:r>
-    </w:p>
-    <w:p>
-      <w:pPr>
-        <w:pStyle w:val="Heading3"/>
-      </w:pPr>
-      <w:r>
-        <w:t>11. Cultura de testing</w:t>
-      </w:r>
-    </w:p>
-    <w:p>
-      <w:pPr>
-        <w:pStyle w:val="ListBullet"/>
-      </w:pPr>
-      <w:r>
-        <w:t xml:space="preserve">No basta el "camino feliz": hay que </w:t>
-      </w:r>
-      <w:r>
-        <w:rPr>
-          <w:b/>
-        </w:rPr>
-        <w:t>romper la app a propósito</w:t>
-      </w:r>
-      <w:r>
-        <w:t xml:space="preserve"> (key inválida, campos vacíos, valores límite) y comprobar que degrada bien.</w:t>
-      </w:r>
-    </w:p>
-    <w:p>
-      <w:pPr>
-        <w:pStyle w:val="ListBullet"/>
-      </w:pPr>
-      <w:r>
-        <w:t>Probar combinaciones extremas (fiesta + presupuesto bajo) destapa los límites del diseño.</w:t>
-      </w:r>
-    </w:p>
-    <w:p>
-      <w:pPr>
-        <w:pStyle w:val="Heading2"/>
-      </w:pPr>
-      <w:r>
-        <w:t>🎯 Objetivo final declarado</w:t>
-      </w:r>
-    </w:p>
-    <w:p>
-      <w:r>
-        <w:t>Que sea una web pública y gratuita que cualquiera pueda usar — para pasársela a amigos y familia. Pendiente para próximas sesiones: mapa interactivo + despliegue en Vercel con la API key protegida en el servidor.</w:t>
+        <w:t>): la calidad</w:t>
       </w:r>
     </w:p>
     <w:sectPr>

</xml_diff>

<commit_message>
Reestructura para Vercel: funcion serverless protege la API key en el servidor
- api/generate-itinerary.js llama a Gemini desde el servidor con process.env.GEMINI_API_KEY
- El frontend detecta file:// vs servidor y elige llamada directa o via /api
- El fallback al generador de reglas se mantiene igual en ambos casos
- README actualizado con la nueva arquitectura y como desplegar
</commit_message>
<xml_diff>
--- a/DIARIO-DEL-PROYECTO.docx
+++ b/DIARIO-DEL-PROYECTO.docx
@@ -882,7 +882,7 @@
         <w:pStyle w:val="Heading3"/>
       </w:pPr>
       <w:r>
-        <w:t>Pendiente</w:t>
+        <w:t>Parte B — Destinos inválidos ✅</w:t>
       </w:r>
     </w:p>
     <w:p>
@@ -890,7 +890,7 @@
         <w:pStyle w:val="ListBullet"/>
       </w:pPr>
       <w:r>
-        <w:t xml:space="preserve">Parte B: detección de destinos inválidos (campo </w:t>
+        <w:t xml:space="preserve">Nuevo campo </w:t>
       </w:r>
       <w:r>
         <w:rPr>
@@ -899,7 +899,7 @@
         <w:t>validDestination</w:t>
       </w:r>
       <w:r>
-        <w:t xml:space="preserve"> en el esquema de Gemini).</w:t>
+        <w:t xml:space="preserve"> (booleano) en el esquema JSON — y pasó a ser el único obligatorio, para que Gemini no esté forzado a inventarse un itinerario cuando el destino no existe.</w:t>
       </w:r>
     </w:p>
     <w:p>
@@ -907,7 +907,78 @@
         <w:pStyle w:val="ListBullet"/>
       </w:pPr>
       <w:r>
-        <w:t>Parte C: favicon y meta tags Open Graph.</w:t>
+        <w:t xml:space="preserve">Si el destino es falso ("asdfghjk", "Narnia"), la IA responde solo </w:t>
+      </w:r>
+      <w:r>
+        <w:rPr>
+          <w:rFonts w:ascii="Consolas" w:hAnsi="Consolas"/>
+        </w:rPr>
+        <w:t>{"validDestination": false}</w:t>
+      </w:r>
+      <w:r>
+        <w:t xml:space="preserve"> y la app muestra un mensaje amable — sin reintentos y, muy importante, SIN caer al generador de reglas (que inventaría un plan para un sitio inexistente). Lección: a veces la robustez consiste en NO dar respuesta.</w:t>
+      </w:r>
+    </w:p>
+    <w:p>
+      <w:pPr>
+        <w:pStyle w:val="Heading3"/>
+      </w:pPr>
+      <w:r>
+        <w:t>Parte C — Carta de presentación ✅</w:t>
+      </w:r>
+    </w:p>
+    <w:p>
+      <w:pPr>
+        <w:pStyle w:val="ListBullet"/>
+      </w:pPr>
+      <w:r>
+        <w:t>Favicon ✈️ como SVG inline (</w:t>
+      </w:r>
+      <w:r>
+        <w:rPr>
+          <w:rFonts w:ascii="Consolas" w:hAnsi="Consolas"/>
+        </w:rPr>
+        <w:t>data:image/svg+xml</w:t>
+      </w:r>
+      <w:r>
+        <w:t>) — sin archivos de imagen.</w:t>
+      </w:r>
+    </w:p>
+    <w:p>
+      <w:pPr>
+        <w:pStyle w:val="ListBullet"/>
+      </w:pPr>
+      <w:r>
+        <w:t>Meta description + etiquetas Open Graph: lo que leen WhatsApp/Twitter para mostrar una tarjeta bonita al compartir el enlace, en vez de la URL pelada.</w:t>
+      </w:r>
+    </w:p>
+    <w:p>
+      <w:pPr>
+        <w:pStyle w:val="ListBullet"/>
+      </w:pPr>
+      <w:r>
+        <w:t>Título de pestaña descriptivo.</w:t>
+      </w:r>
+    </w:p>
+    <w:p>
+      <w:pPr>
+        <w:pStyle w:val="Heading3"/>
+      </w:pPr>
+      <w:r>
+        <w:t>✅ V3.5 completa</w:t>
+      </w:r>
+    </w:p>
+    <w:p>
+      <w:r>
+        <w:t>Persistencia del plan, impresión limpia en PDF, destinos inválidos controlados y carta de presentación lista. La app está preparada para salir al mundo.</w:t>
+      </w:r>
+    </w:p>
+    <w:p>
+      <w:pPr>
+        <w:pStyle w:val="Heading3"/>
+      </w:pPr>
+      <w:r>
+        <w:t>Pendiente</w:t>
       </w:r>
     </w:p>
     <w:p>
@@ -1440,157 +1511,7 @@
         <w:t>config.example.js</w:t>
       </w:r>
       <w:r>
-        <w:t xml:space="preserve"> de plantilla (sí se sube).</w:t>
-      </w:r>
-    </w:p>
-    <w:p>
-      <w:pPr>
-        <w:pStyle w:val="ListBullet"/>
-      </w:pPr>
-      <w:r>
-        <w:t>Hay bots escaneando GitHub 24/7 buscando keys filtradas. No es paranoia, es rutina.</w:t>
-      </w:r>
-    </w:p>
-    <w:p>
-      <w:pPr>
-        <w:pStyle w:val="ListBullet"/>
-      </w:pPr>
-      <w:r>
-        <w:t>Nunca pegarla en chats, pantallazos ni repos.</w:t>
-      </w:r>
-    </w:p>
-    <w:p>
-      <w:pPr>
-        <w:pStyle w:val="Heading3"/>
-      </w:pPr>
-      <w:r>
-        <w:t>8. Códigos de error HTTP (chuleta vivida en primera persona)</w:t>
-      </w:r>
-    </w:p>
-    <w:p>
-      <w:pPr>
-        <w:pStyle w:val="ListBullet"/>
-      </w:pPr>
-      <w:r>
-        <w:rPr>
-          <w:b/>
-        </w:rPr>
-        <w:t>401</w:t>
-      </w:r>
-      <w:r>
-        <w:t xml:space="preserve"> — no autorizado (key mala) · </w:t>
-      </w:r>
-      <w:r>
-        <w:rPr>
-          <w:b/>
-        </w:rPr>
-        <w:t>404</w:t>
-      </w:r>
-      <w:r>
-        <w:t xml:space="preserve"> — no existe (modelo retirado) · </w:t>
-      </w:r>
-      <w:r>
-        <w:rPr>
-          <w:b/>
-        </w:rPr>
-        <w:t>429</w:t>
-      </w:r>
-      <w:r>
-        <w:t xml:space="preserve"> — límite de cuota superado · </w:t>
-      </w:r>
-      <w:r>
-        <w:rPr>
-          <w:b/>
-        </w:rPr>
-        <w:t>503</w:t>
-      </w:r>
-      <w:r>
-        <w:t xml:space="preserve"> — servicio saturado, reintenta luego.</w:t>
-      </w:r>
-    </w:p>
-    <w:p>
-      <w:pPr>
-        <w:pStyle w:val="ListBullet"/>
-      </w:pPr>
-      <w:r>
-        <w:t>Cuatro causas distintas, cuatro soluciones distintas. Distinguirlos ahorra horas de depuración.</w:t>
-      </w:r>
-    </w:p>
-    <w:p>
-      <w:pPr>
-        <w:pStyle w:val="ListBullet"/>
-      </w:pPr>
-      <w:r>
-        <w:t xml:space="preserve">Truco aprendido: cuando dudes de qué modelos/recursos existen, </w:t>
-      </w:r>
-      <w:r>
-        <w:rPr>
-          <w:b/>
-        </w:rPr>
-        <w:t>pregúntale a la propia API</w:t>
-      </w:r>
-      <w:r>
-        <w:t xml:space="preserve"> (</w:t>
-      </w:r>
-      <w:r>
-        <w:rPr>
-          <w:rFonts w:ascii="Consolas" w:hAnsi="Consolas"/>
-        </w:rPr>
-        <w:t>ListModels</w:t>
-      </w:r>
-      <w:r>
-        <w:t>) en vez de suponer.</w:t>
-      </w:r>
-    </w:p>
-    <w:p>
-      <w:pPr>
-        <w:pStyle w:val="Heading3"/>
-      </w:pPr>
-      <w:r>
-        <w:t>9. Integrar un LLM en una app</w:t>
-      </w:r>
-    </w:p>
-    <w:p>
-      <w:pPr>
-        <w:pStyle w:val="ListBullet"/>
-      </w:pPr>
-      <w:r>
-        <w:t xml:space="preserve">Pedir texto libre a la IA y parsearlo = frágil. Pedir </w:t>
-      </w:r>
-      <w:r>
-        <w:rPr>
-          <w:b/>
-        </w:rPr>
-        <w:t>JSON estructurado con esquema</w:t>
-      </w:r>
-      <w:r>
-        <w:t xml:space="preserve"> (</w:t>
-      </w:r>
-      <w:r>
-        <w:rPr>
-          <w:rFonts w:ascii="Consolas" w:hAnsi="Consolas"/>
-        </w:rPr>
-        <w:t>responseSchema</w:t>
-      </w:r>
-      <w:r>
-        <w:t>, "controlled generation") = la API obliga a la IA a cumplir el formato.</w:t>
-      </w:r>
-    </w:p>
-    <w:p>
-      <w:pPr>
-        <w:pStyle w:val="ListBullet"/>
-      </w:pPr>
-      <w:r>
-        <w:t>El prompt se construye con los datos del usuario (</w:t>
-      </w:r>
-      <w:r>
-        <w:rPr>
-          <w:rFonts w:ascii="Consolas" w:hAnsi="Consolas"/>
-        </w:rPr>
-        <w:t>buildPrompt()</w:t>
-      </w:r>
-      <w:r>
-        <w:t>): la calidad</w:t>
+        <w:t xml:space="preserve"> de plantilla (sí se su</w:t>
       </w:r>
     </w:p>
     <w:sectPr>

</xml_diff>

<commit_message>
Actualiza el diario con el arranque del Acto 1 (V4)
</commit_message>
<xml_diff>
--- a/DIARIO-DEL-PROYECTO.docx
+++ b/DIARIO-DEL-PROYECTO.docx
@@ -975,6 +975,140 @@
     </w:p>
     <w:p>
       <w:pPr>
+        <w:pStyle w:val="Heading2"/>
+      </w:pPr>
+      <w:r>
+        <w:t>Sesión 4 — V4: la publicación</w:t>
+      </w:r>
+    </w:p>
+    <w:p>
+      <w:r>
+        <w:rPr>
+          <w:i/>
+        </w:rPr>
+        <w:t>El último gran hito: que la app viva en internet con la key a salvo.</w:t>
+      </w:r>
+    </w:p>
+    <w:p>
+      <w:pPr>
+        <w:pStyle w:val="Heading3"/>
+      </w:pPr>
+      <w:r>
+        <w:t>Acto 1 — Reestructurar para el servidor ✅</w:t>
+      </w:r>
+    </w:p>
+    <w:p>
+      <w:pPr>
+        <w:pStyle w:val="ListBullet"/>
+      </w:pPr>
+      <w:r>
+        <w:t xml:space="preserve">Nueva función serverless </w:t>
+      </w:r>
+      <w:r>
+        <w:rPr>
+          <w:rFonts w:ascii="Consolas" w:hAnsi="Consolas"/>
+        </w:rPr>
+        <w:t>api/generate-itinerary.js</w:t>
+      </w:r>
+      <w:r>
+        <w:t xml:space="preserve">: recibe los datos del formulario por POST, construye el prompt y llama a Gemini </w:t>
+      </w:r>
+      <w:r>
+        <w:rPr>
+          <w:b/>
+        </w:rPr>
+        <w:t>desde el servidor</w:t>
+      </w:r>
+      <w:r>
+        <w:t xml:space="preserve">, leyendo la key de la variable de entorno </w:t>
+      </w:r>
+      <w:r>
+        <w:rPr>
+          <w:rFonts w:ascii="Consolas" w:hAnsi="Consolas"/>
+        </w:rPr>
+        <w:t>GEMINI_API_KEY</w:t>
+      </w:r>
+      <w:r>
+        <w:t>. La key nunca viaja al navegador.</w:t>
+      </w:r>
+    </w:p>
+    <w:p>
+      <w:pPr>
+        <w:pStyle w:val="ListBullet"/>
+      </w:pPr>
+      <w:r>
+        <w:rPr>
+          <w:b/>
+        </w:rPr>
+        <w:t>Detección de entorno</w:t>
+      </w:r>
+      <w:r>
+        <w:t xml:space="preserve"> en el frontend: si la página se abre como archivo local (</w:t>
+      </w:r>
+      <w:r>
+        <w:rPr>
+          <w:rFonts w:ascii="Consolas" w:hAnsi="Consolas"/>
+        </w:rPr>
+        <w:t>file://</w:t>
+      </w:r>
+      <w:r>
+        <w:t xml:space="preserve">), funciona como siempre con </w:t>
+      </w:r>
+      <w:r>
+        <w:rPr>
+          <w:rFonts w:ascii="Consolas" w:hAnsi="Consolas"/>
+        </w:rPr>
+        <w:t>config.js</w:t>
+      </w:r>
+      <w:r>
+        <w:t>; si se sirve desde Vercel (</w:t>
+      </w:r>
+      <w:r>
+        <w:rPr>
+          <w:rFonts w:ascii="Consolas" w:hAnsi="Consolas"/>
+        </w:rPr>
+        <w:t>https://</w:t>
+      </w:r>
+      <w:r>
+        <w:t xml:space="preserve">), llama a </w:t>
+      </w:r>
+      <w:r>
+        <w:rPr>
+          <w:rFonts w:ascii="Consolas" w:hAnsi="Consolas"/>
+        </w:rPr>
+        <w:t>/api/generate-itinerary</w:t>
+      </w:r>
+      <w:r>
+        <w:t xml:space="preserve"> sin necesitar key alguna. El mismo código sirve para desarrollo y producción.</w:t>
+      </w:r>
+    </w:p>
+    <w:p>
+      <w:pPr>
+        <w:pStyle w:val="ListBullet"/>
+      </w:pPr>
+      <w:r>
+        <w:t>El resto del flujo (reintentos, validación, fallback a reglas) quedó idéntico — sin duplicar lógica.</w:t>
+      </w:r>
+    </w:p>
+    <w:p>
+      <w:pPr>
+        <w:pStyle w:val="ListBullet"/>
+      </w:pPr>
+      <w:r>
+        <w:t xml:space="preserve">Concepto clave: </w:t>
+      </w:r>
+      <w:r>
+        <w:rPr>
+          <w:b/>
+        </w:rPr>
+        <w:t>variables de entorno</w:t>
+      </w:r>
+      <w:r>
+        <w:t xml:space="preserve"> — los secretos no viven en archivos del código, viven en la configuración de cada entorno. El mecanismo estándar de la industria.</w:t>
+      </w:r>
+    </w:p>
+    <w:p>
+      <w:pPr>
         <w:pStyle w:val="Heading3"/>
       </w:pPr>
       <w:r>
@@ -986,7 +1120,7 @@
         <w:pStyle w:val="ListBullet"/>
       </w:pPr>
       <w:r>
-        <w:t>Publicación online (GitHub + Vercel) con la API key protegida en el servidor — el último gran hito.</w:t>
+        <w:t>Acto 2: repo en GitHub → importar en Vercel → variable de entorno → desplegar → verificar con F12 que la key no viaja al cliente. La URL pública está a un paso.</w:t>
       </w:r>
     </w:p>
     <w:p>
@@ -1374,144 +1508,7 @@
         <w:pStyle w:val="ListBullet"/>
       </w:pPr>
       <w:r>
-        <w:t>Visto en la práctica: con pocas actividades filtradas, el ciclo se hace corto y los días se repiten. El tamaño de la lista determina el período del ciclo.</w:t>
-      </w:r>
-    </w:p>
-    <w:p>
-      <w:pPr>
-        <w:pStyle w:val="Heading3"/>
-      </w:pPr>
-      <w:r>
-        <w:t>5. Filtrado en cascada con fallback</w:t>
-      </w:r>
-    </w:p>
-    <w:p>
-      <w:pPr>
-        <w:pStyle w:val="ListBullet"/>
-      </w:pPr>
-      <w:r>
-        <w:t xml:space="preserve">Si los filtros del usuario dejan cero resultados, mejor </w:t>
-      </w:r>
-      <w:r>
-        <w:rPr>
-          <w:b/>
-        </w:rPr>
-        <w:t>relajar filtros por orden de prioridad</w:t>
-      </w:r>
-      <w:r>
-        <w:t xml:space="preserve"> que mostrar vacío o romperse.</w:t>
-      </w:r>
-    </w:p>
-    <w:p>
-      <w:pPr>
-        <w:pStyle w:val="ListBullet"/>
-      </w:pPr>
-      <w:r>
-        <w:t>Lo usan buscadores y recomendadores reales (Booking: "no hay hoteles con tus filtros, mira estos parecidos").</w:t>
-      </w:r>
-    </w:p>
-    <w:p>
-      <w:pPr>
-        <w:pStyle w:val="Heading3"/>
-      </w:pPr>
-      <w:r>
-        <w:t>6. Git y control de versiones</w:t>
-      </w:r>
-    </w:p>
-    <w:p>
-      <w:pPr>
-        <w:pStyle w:val="ListBullet"/>
-      </w:pPr>
-      <w:r>
-        <w:rPr>
-          <w:rFonts w:ascii="Consolas" w:hAnsi="Consolas"/>
-        </w:rPr>
-        <w:t>commit</w:t>
-      </w:r>
-      <w:r>
-        <w:t xml:space="preserve"> = foto del proyecto en un momento dado. Commits pequeños y frecuentes.</w:t>
-      </w:r>
-    </w:p>
-    <w:p>
-      <w:pPr>
-        <w:pStyle w:val="ListBullet"/>
-      </w:pPr>
-      <w:r>
-        <w:rPr>
-          <w:rFonts w:ascii="Consolas" w:hAnsi="Consolas"/>
-        </w:rPr>
-        <w:t>.gitignore</w:t>
-      </w:r>
-      <w:r>
-        <w:t xml:space="preserve"> = lista de archivos que Git no debe ver. </w:t>
-      </w:r>
-      <w:r>
-        <w:rPr>
-          <w:b/>
-        </w:rPr>
-        <w:t>Debe configurarse ANTES del primer add</w:t>
-      </w:r>
-      <w:r>
-        <w:t>, porque Git guarda todo el historial: una key subida y luego borrada sigue recuperable en commits antiguos.</w:t>
-      </w:r>
-    </w:p>
-    <w:p>
-      <w:pPr>
-        <w:pStyle w:val="ListBullet"/>
-      </w:pPr>
-      <w:r>
-        <w:t xml:space="preserve">Git + OneDrive se llevan mal: OneDrive bloquea los archivos internos de </w:t>
-      </w:r>
-      <w:r>
-        <w:rPr>
-          <w:rFonts w:ascii="Consolas" w:hAnsi="Consolas"/>
-        </w:rPr>
-        <w:t>.git</w:t>
-      </w:r>
-      <w:r>
-        <w:t xml:space="preserve"> al sincronizar.</w:t>
-      </w:r>
-    </w:p>
-    <w:p>
-      <w:pPr>
-        <w:pStyle w:val="Heading3"/>
-      </w:pPr>
-      <w:r>
-        <w:t>7. API keys y seguridad</w:t>
-      </w:r>
-    </w:p>
-    <w:p>
-      <w:pPr>
-        <w:pStyle w:val="ListBullet"/>
-      </w:pPr>
-      <w:r>
-        <w:t>Una API key es una contraseña: identifica TU cuenta ante un servicio. Quien la tenga consume tu cuota en tu nombre.</w:t>
-      </w:r>
-    </w:p>
-    <w:p>
-      <w:pPr>
-        <w:pStyle w:val="ListBullet"/>
-      </w:pPr>
-      <w:r>
-        <w:t xml:space="preserve">Patrón correcto: key en </w:t>
-      </w:r>
-      <w:r>
-        <w:rPr>
-          <w:rFonts w:ascii="Consolas" w:hAnsi="Consolas"/>
-        </w:rPr>
-        <w:t>config.js</w:t>
-      </w:r>
-      <w:r>
-        <w:t xml:space="preserve"> (ignorado por Git) + </w:t>
-      </w:r>
-      <w:r>
-        <w:rPr>
-          <w:rFonts w:ascii="Consolas" w:hAnsi="Consolas"/>
-        </w:rPr>
-        <w:t>config.example.js</w:t>
-      </w:r>
-      <w:r>
-        <w:t xml:space="preserve"> de plantilla (sí se su</w:t>
+        <w:t>Visto en la práctica: con pocas actividades filtradas,</w:t>
       </w:r>
     </w:p>
     <w:sectPr>

</xml_diff>

<commit_message>
V4 completada: app publicada en Vercel, README y diario actualizados
</commit_message>
<xml_diff>
--- a/DIARIO-DEL-PROYECTO.docx
+++ b/DIARIO-DEL-PROYECTO.docx
@@ -1112,15 +1112,7 @@
         <w:pStyle w:val="Heading3"/>
       </w:pPr>
       <w:r>
-        <w:t>Pendiente</w:t>
-      </w:r>
-    </w:p>
-    <w:p>
-      <w:pPr>
-        <w:pStyle w:val="ListBullet"/>
-      </w:pPr>
-      <w:r>
-        <w:t>Acto 2: repo en GitHub → importar en Vercel → variable de entorno → desplegar → verificar con F12 que la key no viaja al cliente. La URL pública está a un paso.</w:t>
+        <w:t>Acto 2 — El despliegue ✅ 🚀</w:t>
       </w:r>
     </w:p>
     <w:p>
@@ -1128,31 +1120,7 @@
         <w:rPr>
           <w:i/>
         </w:rPr>
-        <w:t>(próximas sesiones se irán añadiendo aquí)</w:t>
-      </w:r>
-    </w:p>
-    <w:p>
-      <w:pPr>
-        <w:pStyle w:val="Heading1"/>
-      </w:pPr>
-      <w:r>
-        <w:t>PARTE 2 — Apuntes 📚</w:t>
-      </w:r>
-    </w:p>
-    <w:p>
-      <w:r>
-        <w:rPr>
-          <w:i/>
-        </w:rPr>
-        <w:t>La teoría que este proyecto enseñó, en orden de aparición.</w:t>
-      </w:r>
-    </w:p>
-    <w:p>
-      <w:pPr>
-        <w:pStyle w:val="Heading3"/>
-      </w:pPr>
-      <w:r>
-        <w:t>1. Las tres capas de una web</w:t>
+        <w:t>El día que la app salió de un ordenador y entró en internet.</w:t>
       </w:r>
     </w:p>
     <w:p>
@@ -1163,201 +1131,46 @@
         <w:rPr>
           <w:b/>
         </w:rPr>
-        <w:t>HTML</w:t>
+        <w:t>GitHub</w:t>
       </w:r>
       <w:r>
-        <w:t xml:space="preserve"> = estructura (qué hay), </w:t>
-      </w:r>
-      <w:r>
-        <w:rPr>
-          <w:b/>
-        </w:rPr>
-        <w:t>CSS</w:t>
-      </w:r>
-      <w:r>
-        <w:t xml:space="preserve"> = presentación (cómo se ve), </w:t>
-      </w:r>
-      <w:r>
-        <w:rPr>
-          <w:b/>
-        </w:rPr>
-        <w:t>JS</w:t>
-      </w:r>
-      <w:r>
-        <w:t xml:space="preserve"> = comportamiento (qué hace).</w:t>
-      </w:r>
-    </w:p>
-    <w:p>
-      <w:pPr>
-        <w:pStyle w:val="ListBullet"/>
-      </w:pPr>
-      <w:r>
-        <w:t xml:space="preserve">Separarlas en archivos no es manía: cada una tiene una responsabilidad. Es el principio de </w:t>
-      </w:r>
-      <w:r>
-        <w:rPr>
-          <w:b/>
-        </w:rPr>
-        <w:t>separación de responsabilidades</w:t>
-      </w:r>
-      <w:r>
-        <w:t>, que reaparece en todo el software.</w:t>
-      </w:r>
-    </w:p>
-    <w:p>
-      <w:pPr>
-        <w:pStyle w:val="Heading3"/>
-      </w:pPr>
-      <w:r>
-        <w:t>2. HTML esencial</w:t>
-      </w:r>
-    </w:p>
-    <w:p>
-      <w:pPr>
-        <w:pStyle w:val="ListBullet"/>
-      </w:pPr>
-      <w:r>
-        <w:t xml:space="preserve">Etiquetas en parejas </w:t>
+        <w:t xml:space="preserve">: repo público </w:t>
       </w:r>
       <w:r>
         <w:rPr>
           <w:rFonts w:ascii="Consolas" w:hAnsi="Consolas"/>
         </w:rPr>
-        <w:t>&lt;h1&gt;...&lt;/h1&gt;</w:t>
+        <w:t>javiaag/planificador-viajes</w:t>
       </w:r>
       <w:r>
-        <w:t>; algunas van solas (</w:t>
+        <w:t xml:space="preserve"> creado, primer </w:t>
       </w:r>
       <w:r>
         <w:rPr>
           <w:rFonts w:ascii="Consolas" w:hAnsi="Consolas"/>
         </w:rPr>
-        <w:t>&lt;input&gt;</w:t>
+        <w:t>git push</w:t>
       </w:r>
       <w:r>
-        <w:t>).</w:t>
-      </w:r>
-    </w:p>
-    <w:p>
-      <w:pPr>
-        <w:pStyle w:val="ListBullet"/>
-      </w:pPr>
-      <w:r>
-        <w:t xml:space="preserve">El </w:t>
+        <w:t xml:space="preserve"> con autorización desde el navegador. Comprobación satisfactoria: </w:t>
       </w:r>
       <w:r>
         <w:rPr>
           <w:rFonts w:ascii="Consolas" w:hAnsi="Consolas"/>
         </w:rPr>
-        <w:t>id</w:t>
+        <w:t>config.js</w:t>
       </w:r>
       <w:r>
-        <w:t xml:space="preserve"> es el nombre interno de un elemento: es como JS lo encuentra (</w:t>
+        <w:t xml:space="preserve"> NO está en el repo — el </w:t>
       </w:r>
       <w:r>
         <w:rPr>
           <w:rFonts w:ascii="Consolas" w:hAnsi="Consolas"/>
         </w:rPr>
-        <w:t>getElementById</w:t>
+        <w:t>.gitignore</w:t>
       </w:r>
       <w:r>
-        <w:t>).</w:t>
-      </w:r>
-    </w:p>
-    <w:p>
-      <w:pPr>
-        <w:pStyle w:val="ListBullet"/>
-      </w:pPr>
-      <w:r>
-        <w:t xml:space="preserve">Formularios: </w:t>
-      </w:r>
-      <w:r>
-        <w:rPr>
-          <w:rFonts w:ascii="Consolas" w:hAnsi="Consolas"/>
-        </w:rPr>
-        <w:t>&lt;form&gt;</w:t>
-      </w:r>
-      <w:r>
-        <w:t xml:space="preserve">, </w:t>
-      </w:r>
-      <w:r>
-        <w:rPr>
-          <w:rFonts w:ascii="Consolas" w:hAnsi="Consolas"/>
-        </w:rPr>
-        <w:t>&lt;input type="text|number"&gt;</w:t>
-      </w:r>
-      <w:r>
-        <w:t xml:space="preserve">, </w:t>
-      </w:r>
-      <w:r>
-        <w:rPr>
-          <w:rFonts w:ascii="Consolas" w:hAnsi="Consolas"/>
-        </w:rPr>
-        <w:t>&lt;select&gt;</w:t>
-      </w:r>
-      <w:r>
-        <w:t xml:space="preserve"> + </w:t>
-      </w:r>
-      <w:r>
-        <w:rPr>
-          <w:rFonts w:ascii="Consolas" w:hAnsi="Consolas"/>
-        </w:rPr>
-        <w:t>&lt;option&gt;</w:t>
-      </w:r>
-      <w:r>
-        <w:t xml:space="preserve">, </w:t>
-      </w:r>
-      <w:r>
-        <w:rPr>
-          <w:rFonts w:ascii="Consolas" w:hAnsi="Consolas"/>
-        </w:rPr>
-        <w:t>&lt;label for=...&gt;</w:t>
-      </w:r>
-      <w:r>
-        <w:t>.</w:t>
-      </w:r>
-    </w:p>
-    <w:p>
-      <w:pPr>
-        <w:pStyle w:val="ListBullet"/>
-      </w:pPr>
-      <w:r>
-        <w:t xml:space="preserve">Validación gratis del navegador: </w:t>
-      </w:r>
-      <w:r>
-        <w:rPr>
-          <w:rFonts w:ascii="Consolas" w:hAnsi="Consolas"/>
-        </w:rPr>
-        <w:t>required</w:t>
-      </w:r>
-      <w:r>
-        <w:t xml:space="preserve">, </w:t>
-      </w:r>
-      <w:r>
-        <w:rPr>
-          <w:rFonts w:ascii="Consolas" w:hAnsi="Consolas"/>
-        </w:rPr>
-        <w:t>min</w:t>
-      </w:r>
-      <w:r>
-        <w:t xml:space="preserve">, </w:t>
-      </w:r>
-      <w:r>
-        <w:rPr>
-          <w:rFonts w:ascii="Consolas" w:hAnsi="Consolas"/>
-        </w:rPr>
-        <w:t>max</w:t>
-      </w:r>
-      <w:r>
-        <w:t xml:space="preserve"> — frena envíos inválidos sin escribir una línea de JS.</w:t>
-      </w:r>
-    </w:p>
-    <w:p>
-      <w:pPr>
-        <w:pStyle w:val="Heading3"/>
-      </w:pPr>
-      <w:r>
-        <w:t>3. JavaScript esencial</w:t>
+        <w:t xml:space="preserve"> cumplió.</w:t>
       </w:r>
     </w:p>
     <w:p>
@@ -1368,19 +1181,19 @@
         <w:rPr>
           <w:b/>
         </w:rPr>
-        <w:t>Objetos</w:t>
+        <w:t>Sorpresa por el camino</w:t>
       </w:r>
       <w:r>
-        <w:t xml:space="preserve"> </w:t>
+        <w:t xml:space="preserve">: al entrar en Vercel, ya existía una cuenta... con el </w:t>
       </w:r>
       <w:r>
         <w:rPr>
           <w:rFonts w:ascii="Consolas" w:hAnsi="Consolas"/>
         </w:rPr>
-        <w:t>{clave: valor}</w:t>
+        <w:t>predictor-mundial</w:t>
       </w:r>
       <w:r>
-        <w:t>: el equivalente a los diccionarios de Python. Pasar de "lista de textos" a "lista de objetos con atributos" fue el salto de calidad de la V1.5 (como pasar de vectores a DataFrames).</w:t>
+        <w:t xml:space="preserve"> dentro. La primera app de Javi y esta van a vivir juntas.</w:t>
       </w:r>
     </w:p>
     <w:p>
@@ -1391,33 +1204,10 @@
         <w:rPr>
           <w:b/>
         </w:rPr>
-        <w:t>Eventos</w:t>
+        <w:t>Lección de seguridad en vivo</w:t>
       </w:r>
       <w:r>
-        <w:t xml:space="preserve">: </w:t>
-      </w:r>
-      <w:r>
-        <w:rPr>
-          <w:rFonts w:ascii="Consolas" w:hAnsi="Consolas"/>
-        </w:rPr>
-        <w:t>addEventListener("submit", ...)</w:t>
-      </w:r>
-      <w:r>
-        <w:t xml:space="preserve"> — el código reacciona a lo que hace el usuario.</w:t>
-      </w:r>
-    </w:p>
-    <w:p>
-      <w:pPr>
-        <w:pStyle w:val="ListBullet"/>
-      </w:pPr>
-      <w:r>
-        <w:rPr>
-          <w:rFonts w:ascii="Consolas" w:hAnsi="Consolas"/>
-        </w:rPr>
-        <w:t>event.preventDefault()</w:t>
-      </w:r>
-      <w:r>
-        <w:t>: evita que el formulario recargue la página (comportamiento por defecto del navegador).</w:t>
+        <w:t>: la key apareció visible en un pantallazo compartido durante el proceso → rotación inmediata (borrar key vieja, crear nueva). Regla grabada a fuego: antes de capturar pantalla, cerrar la pestaña de config.js.</w:t>
       </w:r>
     </w:p>
     <w:p>
@@ -1428,28 +1218,28 @@
         <w:rPr>
           <w:b/>
         </w:rPr>
-        <w:t>Template literals</w:t>
+        <w:t>Despliegue</w:t>
       </w:r>
       <w:r>
-        <w:t xml:space="preserve">: </w:t>
+        <w:t xml:space="preserve">: importar repo en Vercel → variable de entorno </w:t>
       </w:r>
       <w:r>
         <w:rPr>
           <w:rFonts w:ascii="Consolas" w:hAnsi="Consolas"/>
         </w:rPr>
-        <w:t xml:space="preserve">` </w:t>
+        <w:t>GEMINI_API_KEY</w:t>
       </w:r>
       <w:r>
-        <w:t>Itinerario para ${destination}</w:t>
+        <w:t xml:space="preserve"> (la nueva) → Deploy → confeti. URL pública: </w:t>
       </w:r>
       <w:r>
         <w:rPr>
           <w:rFonts w:ascii="Consolas" w:hAnsi="Consolas"/>
         </w:rPr>
-        <w:t xml:space="preserve"> </w:t>
+        <w:t>planificador-viajes-chi.vercel.app</w:t>
       </w:r>
       <w:r>
-        <w:t>` — construir texto con variables dentro.</w:t>
+        <w:t>.</w:t>
       </w:r>
     </w:p>
     <w:p>
@@ -1457,58 +1247,99 @@
         <w:pStyle w:val="Heading3"/>
       </w:pPr>
       <w:r>
-        <w:t>4. El operador módulo (%)</w:t>
+        <w:t>Los exámenes de graduación ✅</w:t>
       </w:r>
     </w:p>
     <w:p>
-      <w:pPr>
-        <w:pStyle w:val="ListBullet"/>
-      </w:pPr>
       <w:r>
-        <w:t xml:space="preserve">Resto de una división: </w:t>
+        <w:t>1. Plan real generado en la URL pública con IA y mapa — funciona.</w:t>
+      </w:r>
+    </w:p>
+    <w:p>
+      <w:r>
+        <w:t>2. Destino inventado — mensaje amable, sin plan alucinado.</w:t>
+      </w:r>
+    </w:p>
+    <w:p>
+      <w:r>
+        <w:t xml:space="preserve">3. </w:t>
+      </w:r>
+      <w:r>
+        <w:rPr>
+          <w:b/>
+        </w:rPr>
+        <w:t>El examen de seguridad</w:t>
+      </w:r>
+      <w:r>
+        <w:t xml:space="preserve">: F12 → Network → la petición a </w:t>
       </w:r>
       <w:r>
         <w:rPr>
           <w:rFonts w:ascii="Consolas" w:hAnsi="Consolas"/>
         </w:rPr>
-        <w:t>6 % 4 = 2</w:t>
+        <w:t>/api/generate-itinerary</w:t>
       </w:r>
       <w:r>
-        <w:t>.</w:t>
-      </w:r>
-    </w:p>
-    <w:p>
-      <w:pPr>
-        <w:pStyle w:val="ListBullet"/>
-      </w:pPr>
-      <w:r>
-        <w:t xml:space="preserve">Uso estrella: </w:t>
-      </w:r>
-      <w:r>
-        <w:rPr>
-          <w:b/>
-        </w:rPr>
-        <w:t>ciclar por una lista finita</w:t>
-      </w:r>
-      <w:r>
-        <w:t xml:space="preserve"> — </w:t>
+        <w:t xml:space="preserve"> lleva destino, días y presupuesto... y ni rastro de la key. Bonus poético: el 404 de </w:t>
       </w:r>
       <w:r>
         <w:rPr>
           <w:rFonts w:ascii="Consolas" w:hAnsi="Consolas"/>
         </w:rPr>
-        <w:t>lista[(dia - 1) % lista.length]</w:t>
+        <w:t>config.js</w:t>
       </w:r>
       <w:r>
-        <w:t xml:space="preserve"> repite 1,2,3,4,1,2,3...</w:t>
+        <w:t xml:space="preserve"> en la consola es la </w:t>
+      </w:r>
+      <w:r>
+        <w:rPr>
+          <w:i/>
+        </w:rPr>
+        <w:t>prueba</w:t>
+      </w:r>
+      <w:r>
+        <w:t xml:space="preserve"> de que el archivo de la key no existe en internet.</w:t>
+      </w:r>
+    </w:p>
+    <w:p>
+      <w:r>
+        <w:t>4. La app funcionando en el móvil, compartible por WhatsApp con su tarjeta y su favicon ✈️.</w:t>
       </w:r>
     </w:p>
     <w:p>
       <w:pPr>
-        <w:pStyle w:val="ListBullet"/>
+        <w:pStyle w:val="Heading3"/>
       </w:pPr>
       <w:r>
-        <w:t>Visto en la práctica: con pocas actividades filtradas,</w:t>
+        <w:t>🏁 V4 COMPLETA — EL PROYECTO ESTÁ VIVO EN INTERNET</w:t>
+      </w:r>
+    </w:p>
+    <w:p>
+      <w:r>
+        <w:t xml:space="preserve">De un </w:t>
+      </w:r>
+      <w:r>
+        <w:rPr>
+          <w:rFonts w:ascii="Consolas" w:hAnsi="Consolas"/>
+        </w:rPr>
+        <w:t>index.html</w:t>
+      </w:r>
+      <w:r>
+        <w:t xml:space="preserve"> vacío a una app pública con IA, mapa interactivo y despliegue continuo: cada </w:t>
+      </w:r>
+      <w:r>
+        <w:rPr>
+          <w:rFonts w:ascii="Consolas" w:hAnsi="Consolas"/>
+        </w:rPr>
+        <w:t>git push</w:t>
+      </w:r>
+      <w:r>
+        <w:t xml:space="preserve"> futuro actualizará la web automáticamente para todos sus usuarios. El backlog (enlaces a Google Maps, regenerar día, compartir por enlace, idiomas) queda esperando al feedback de los primeros usuarios reales: la familia.</w:t>
+      </w:r>
+    </w:p>
+    <w:p>
+      <w:r>
+        <w:t>*(próximas sesiones s</w:t>
       </w:r>
     </w:p>
     <w:sectPr>

</xml_diff>

<commit_message>
V5 Parte C: recomendaciones por dia
- Cada dia lleva sus propias recomendaciones (1-2 restaurantes cerca
  de sus actividades + un tip especifico), en seccion plegada dentro
  de la tarjeta del dia
- La tarjeta general de recomendaciones queda solo con tips globales
  del destino
- Aviso reforzado: las direcciones son el dato menos fiable estimado
  por IA
- Compatibilidad con planes guardados del esquema anterior (sin
  recomendaciones por dia)
</commit_message>
<xml_diff>
--- a/DIARIO-DEL-PROYECTO.docx
+++ b/DIARIO-DEL-PROYECTO.docx
@@ -1338,8 +1338,11 @@
       </w:r>
     </w:p>
     <w:p>
+      <w:pPr>
+        <w:pStyle w:val="Heading2"/>
+      </w:pPr>
       <w:r>
-        <w:t>*(próximas sesiones s</w:t>
+        <w:t>Sesión 5 — V5: l</w:t>
       </w:r>
     </w:p>
     <w:sectPr>

</xml_diff>